<commit_message>
Use underscore notation for all variables (f_c, v_p, v_g, λ_g)
</commit_message>
<xml_diff>
--- a/Labs/Lab 3/ECE332_Lab3_Waveguides.docx
+++ b/Labs/Lab 3/ECE332_Lab3_Waveguides.docx
@@ -286,7 +286,7 @@
         <w:rPr>
           <w:sz w:val="22"/>
         </w:rPr>
-        <w:t>Measure the standing-wave pattern inside a slotted rectangular waveguide at three input frequencies (11 GHz, 9.5 GHz, 8.5 GHz) using a traveling probe and SWR meter. From the minima/maxima positions calculate the waveguide wavelength λg, phase velocity vp, and group velocity vg for each frequency. Also measure the physical dimensions a and b of the waveguide and use them to compute the cutoff frequencies of the three lowest modes.</w:t>
+        <w:t>Measure the standing-wave pattern inside a slotted rectangular waveguide at three input frequencies (11 GHz, 9.5 GHz, 8.5 GHz) using a traveling probe and SWR meter. From the minima/maxima positions calculate the waveguide wavelength λ_g, phase velocity v_p, and group velocity v_g for each frequency. Also measure the physical dimensions a and b of the waveguide and use them to compute the cutoff frequencies of the three lowest modes.</w:t>
       </w:r>
     </w:p>
     <w:p>
@@ -353,7 +353,7 @@
         <w:rPr>
           <w:sz w:val="22"/>
         </w:rPr>
-        <w:t>Inside the waveguide the wave bounces at an angle between the walls, producing a standing wave along z when the far end is short-circuited. The waveguide wavelength λg is longer than the free-space wavelength λ = c/f:</w:t>
+        <w:t>Inside the waveguide the wave bounces at an angle between the walls, producing a standing wave along z when the far end is short-circuited. The waveguide wavelength λ_g is longer than the free-space wavelength λ = c/f:</w:t>
       </w:r>
     </w:p>
     <w:p>
@@ -364,7 +364,7 @@
         <w:rPr>
           <w:sz w:val="22"/>
         </w:rPr>
-        <w:t xml:space="preserve">    λg = 2π / β = 2π / √(ω²με − (mπ/a)² − (nπ/b)²)     [Eq. 4]</w:t>
+        <w:t xml:space="preserve">    λ_g = 2π / β = 2π / √(ω²με − (mπ/a)² − (nπ/b)²)     [Eq. 4]</w:t>
       </w:r>
     </w:p>
     <w:p>
@@ -386,7 +386,7 @@
         <w:rPr>
           <w:sz w:val="22"/>
         </w:rPr>
-        <w:t xml:space="preserve">    vp = f λg = vp0 / √(1 − (fc/f)²)     [Eq. 5]</w:t>
+        <w:t xml:space="preserve">    v_p = f λ_g = v_p0 / √(1 − (f_c/f)²)     [Eq. 5]</w:t>
       </w:r>
     </w:p>
     <w:p>
@@ -397,7 +397,7 @@
         <w:rPr>
           <w:sz w:val="22"/>
         </w:rPr>
-        <w:t>Note vp &gt; c; it carries no information. The group velocity (information/energy speed) is:</w:t>
+        <w:t>Note v_p &gt; c; it carries no information. The group velocity (information/energy speed) is:</w:t>
       </w:r>
     </w:p>
     <w:p>
@@ -408,7 +408,7 @@
         <w:rPr>
           <w:sz w:val="22"/>
         </w:rPr>
-        <w:t xml:space="preserve">    vg = vp0 √(1 − (fc/f)²) = (1/√με)(λ/λg)     [Eq. 6]</w:t>
+        <w:t xml:space="preserve">    v_g = v_p0 √(1 − (f_c/f)²) = (1/√με)(λ/λ_g)     [Eq. 6]</w:t>
       </w:r>
     </w:p>
     <w:p>
@@ -419,7 +419,7 @@
         <w:rPr>
           <w:sz w:val="22"/>
         </w:rPr>
-        <w:t>Note: vp · vg = c² (for air-filled guide), so vg &lt; c.</w:t>
+        <w:t>Note: v_p · v_g = c² (for air-filled guide), so v_g &lt; c.</w:t>
       </w:r>
     </w:p>
     <w:p>
@@ -430,7 +430,7 @@
         <w:rPr>
           <w:sz w:val="22"/>
         </w:rPr>
-        <w:t>The waveguide wavelength is measured from successive minima/maxima. Each consecutive min↔max pair is λg/4 apart:</w:t>
+        <w:t>The waveguide wavelength is measured from successive minima/maxima. Each consecutive min↔max pair is λ_g/4 apart:</w:t>
       </w:r>
     </w:p>
     <w:p>
@@ -441,7 +441,7 @@
         <w:rPr>
           <w:sz w:val="22"/>
         </w:rPr>
-        <w:t xml:space="preserve">    λg = 4Δd = 4(d_{n+1} − d_n)     [Eq. 7]</w:t>
+        <w:t xml:space="preserve">    λ_g = 4Δd = 4(d_{n+1} − d_n)     [Eq. 7]</w:t>
       </w:r>
     </w:p>
     <w:p>
@@ -571,7 +571,7 @@
         <w:rPr>
           <w:sz w:val="22"/>
         </w:rPr>
-        <w:t>λg = 2π/β  — waveguide wavelength (Eq. 4)</w:t>
+        <w:t>λ_g = 2π/β  — waveguide wavelength (Eq. 4)</w:t>
       </w:r>
     </w:p>
     <w:p>
@@ -583,7 +583,7 @@
         <w:rPr>
           <w:sz w:val="22"/>
         </w:rPr>
-        <w:t>vp = f λg = vp0 / √(1−(fc/f)²)  — phase velocity (Eq. 5)</w:t>
+        <w:t>v_p = f λ_g = v_p0 / √(1−(f_c/f)²)  — phase velocity (Eq. 5)</w:t>
       </w:r>
     </w:p>
     <w:p>
@@ -595,7 +595,7 @@
         <w:rPr>
           <w:sz w:val="22"/>
         </w:rPr>
-        <w:t>vg = vp0 √(1−(fc/f)²) = c²/vp  — group velocity (Eq. 6)</w:t>
+        <w:t>v_g = v_p0 √(1−(f_c/f)²) = c²/v_p  — group velocity (Eq. 6)</w:t>
       </w:r>
     </w:p>
     <w:p>
@@ -607,7 +607,7 @@
         <w:rPr>
           <w:sz w:val="22"/>
         </w:rPr>
-        <w:t>λg = 4Δd  — λg from consecutive min/max positions (Eq. 7)</w:t>
+        <w:t>λ_g = 4Δd  — λ_g from consecutive min/max positions (Eq. 7)</w:t>
       </w:r>
     </w:p>
     <w:p>
@@ -641,7 +641,7 @@
         <w:rPr>
           <w:sz w:val="22"/>
         </w:rPr>
-        <w:t>Note: λg, vp, vg calculated only for Min rows using λg = 4×|Min_n − Max_n|. Average row uses all 5 consecutive Δd pairs.</w:t>
+        <w:t>Note: λ_g, v_p, v_g calculated only for Min rows using λ_g = 4×|Min_n − Max_n|. Average row uses all 5 consecutive Δd pairs.</w:t>
       </w:r>
     </w:p>
     <w:tbl>
@@ -692,7 +692,7 @@
               <w:rPr>
                 <w:b/>
               </w:rPr>
-              <w:t>λg (mm)</w:t>
+              <w:t>λ_g (mm)</w:t>
             </w:r>
           </w:p>
         </w:tc>
@@ -705,7 +705,7 @@
               <w:rPr>
                 <w:b/>
               </w:rPr>
-              <w:t>vp (m/s)</w:t>
+              <w:t>v_p (m/s)</w:t>
             </w:r>
           </w:p>
         </w:tc>
@@ -718,7 +718,7 @@
               <w:rPr>
                 <w:b/>
               </w:rPr>
-              <w:t>vg (m/s)</w:t>
+              <w:t>v_g (m/s)</w:t>
             </w:r>
           </w:p>
         </w:tc>
@@ -2066,7 +2066,7 @@
         <w:rPr>
           <w:sz w:val="22"/>
         </w:rPr>
-        <w:t>The free-space wavelength λ = c/f is the spatial period of the wave if it propagated in a straight line through free space at the speed of light. Inside the waveguide, the TE₁₀ mode can be visualized as two plane waves bouncing obliquely between the broad walls. These waves travel at an angle θ to the z-axis, so their axial phase advances more slowly than in free space. The resulting axial period — the waveguide wavelength λg = λ/√(1−(fc/f)²) — is always greater than λ and grows to infinity as f → fc.</w:t>
+        <w:t>The free-space wavelength λ = c/f is the spatial period of the wave if it propagated in a straight line through free space at the speed of light. Inside the waveguide, the TE₁₀ mode can be visualized as two plane waves bouncing obliquely between the broad walls. These waves travel at an angle θ to the z-axis, so their axial phase advances more slowly than in free space. The resulting axial period — the waveguide wavelength λ_g = λ/√(1−(f_c/f)²) — is always greater than λ and grows to infinity as f → f_c.</w:t>
       </w:r>
     </w:p>
     <w:p>
@@ -2112,7 +2112,7 @@
         <w:rPr>
           <w:sz w:val="22"/>
         </w:rPr>
-        <w:t>The short circuit forces E = 0 at z = 0. Minima repeat every λg/2. The nearest detectable minimum is n × (λg/2) from the termination, where n is the smallest integer that places the minimum within probe reach.</w:t>
+        <w:t>The short circuit forces E = 0 at z = 0. Minima repeat every λ_g/2. The nearest detectable minimum is n × (λ_g/2) from the termination, where n is the smallest integer that places the minimum within probe reach.</w:t>
       </w:r>
     </w:p>
     <w:p>
@@ -2123,7 +2123,7 @@
         <w:rPr>
           <w:sz w:val="22"/>
         </w:rPr>
-        <w:t>11 GHz:   λg/2 = 16.36 mm  →  n = 5  →  expected d = 81.80 mm,  measured = 83.5 mm,  % diff = 2.1%</w:t>
+        <w:t>11 GHz:   λ_g/2 = 16.36 mm  →  n = 5  →  expected d = 81.80 mm,  measured = 83.5 mm,  % diff = 2.1%</w:t>
       </w:r>
     </w:p>
     <w:p>
@@ -2134,7 +2134,7 @@
         <w:rPr>
           <w:sz w:val="22"/>
         </w:rPr>
-        <w:t>9.5 GHz:  λg/2 = 21.56 mm  →  n ≈ 4.43 → nearest int n = 4  →  expected d = 86.24 mm,  measured = 95.6 mm,  % diff = 10.9%</w:t>
+        <w:t>9.5 GHz:  λ_g/2 = 21.56 mm  →  n ≈ 4.43 → nearest int n = 4  →  expected d = 86.24 mm,  measured = 95.6 mm,  % diff = 10.9%</w:t>
       </w:r>
     </w:p>
     <w:p>
@@ -2145,7 +2145,7 @@
         <w:rPr>
           <w:sz w:val="22"/>
         </w:rPr>
-        <w:t>8.5 GHz:  λg/2 = 27.84 mm  →  n = 3  →  expected d = 83.52 mm,  measured = 85.4 mm,  % diff = 2.3%</w:t>
+        <w:t>8.5 GHz:  λ_g/2 = 27.84 mm  →  n = 3  →  expected d = 83.52 mm,  measured = 85.4 mm,  % diff = 2.3%</w:t>
       </w:r>
     </w:p>
     <w:p>
@@ -2179,7 +2179,7 @@
         <w:rPr>
           <w:sz w:val="22"/>
         </w:rPr>
-        <w:t>n = d_measured / (λg/2):</w:t>
+        <w:t>n = d_measured / (λ_g/2):</w:t>
       </w:r>
     </w:p>
     <w:p>
@@ -2360,7 +2360,7 @@
         <w:rPr>
           <w:sz w:val="22"/>
         </w:rPr>
-        <w:t>(c) Back-calculating f_c from measured λg using f_c = f √(1 − (λ/λg)²):</w:t>
+        <w:t>(c) Back-calculating f_c from measured λ_g using f_c = f √(1 − (λ/λ_g)²):</w:t>
       </w:r>
     </w:p>
     <w:p>
@@ -2371,7 +2371,7 @@
         <w:rPr>
           <w:sz w:val="22"/>
         </w:rPr>
-        <w:t>11 GHz:   λ = 27.27 mm,  λg = 32.72 mm  →  f_c = 6.08 GHz</w:t>
+        <w:t>11 GHz:   λ = 27.27 mm,  λ_g = 32.72 mm  →  f_c = 6.08 GHz</w:t>
       </w:r>
     </w:p>
     <w:p>
@@ -2382,7 +2382,7 @@
         <w:rPr>
           <w:sz w:val="22"/>
         </w:rPr>
-        <w:t>9.5 GHz:  λ = 31.58 mm,  λg = 43.12 mm  →  f_c = 6.47 GHz</w:t>
+        <w:t>9.5 GHz:  λ = 31.58 mm,  λ_g = 43.12 mm  →  f_c = 6.47 GHz</w:t>
       </w:r>
     </w:p>
     <w:p>
@@ -2393,7 +2393,7 @@
         <w:rPr>
           <w:sz w:val="22"/>
         </w:rPr>
-        <w:t>8.5 GHz:  λ = 35.29 mm,  λg = 55.68 mm  →  f_c = 6.57 GHz</w:t>
+        <w:t>8.5 GHz:  λ = 35.29 mm,  λ_g = 55.68 mm  →  f_c = 6.57 GHz</w:t>
       </w:r>
     </w:p>
     <w:p>
@@ -2489,7 +2489,7 @@
         <w:rPr>
           <w:sz w:val="22"/>
         </w:rPr>
-        <w:t>Combining the cavity-measured frequency with λg from Experiment 1 allows an independent cross-check of phase velocity:</w:t>
+        <w:t>Combining the cavity-measured frequency with λ_g from Experiment 1 allows an independent cross-check of phase velocity:</w:t>
       </w:r>
     </w:p>
     <w:p>
@@ -2500,7 +2500,7 @@
         <w:rPr>
           <w:sz w:val="22"/>
         </w:rPr>
-        <w:t xml:space="preserve">    vp = λg · f     [Eq. 5]</w:t>
+        <w:t xml:space="preserve">    v_p = λ_g · f     [Eq. 5]</w:t>
       </w:r>
     </w:p>
     <w:p>
@@ -2511,7 +2511,7 @@
         <w:rPr>
           <w:sz w:val="22"/>
         </w:rPr>
-        <w:t xml:space="preserve">    vg = c² / vp    [Eq. 6]</w:t>
+        <w:t xml:space="preserve">    v_g = c² / v_p    [Eq. 6]</w:t>
       </w:r>
     </w:p>
     <w:p>
@@ -2558,7 +2558,7 @@
         <w:rPr>
           <w:sz w:val="22"/>
         </w:rPr>
-        <w:t>vp = λg · f  — phase velocity (Eq. 5)</w:t>
+        <w:t>v_p = λ_g · f  — phase velocity (Eq. 5)</w:t>
       </w:r>
     </w:p>
     <w:p>
@@ -2570,7 +2570,7 @@
         <w:rPr>
           <w:sz w:val="22"/>
         </w:rPr>
-        <w:t>vg = c² / vp  — group velocity (Eq. 6)</w:t>
+        <w:t>v_g = c² / v_p  — group velocity (Eq. 6)</w:t>
       </w:r>
     </w:p>
     <w:p>
@@ -2656,7 +2656,7 @@
               <w:rPr>
                 <w:b/>
               </w:rPr>
-              <w:t>vg (m/s)</w:t>
+              <w:t>v_g (m/s)</w:t>
             </w:r>
           </w:p>
         </w:tc>
@@ -2669,7 +2669,7 @@
               <w:rPr>
                 <w:b/>
               </w:rPr>
-              <w:t>vp (m/s)</w:t>
+              <w:t>v_p (m/s)</w:t>
             </w:r>
           </w:p>
         </w:tc>
@@ -2833,7 +2833,7 @@
         <w:rPr>
           <w:sz w:val="22"/>
         </w:rPr>
-        <w:t>Using the measured values for frequency and wavelength, calculate the phase velocity of the wave: vp = λg · f. How close (i.e. percentage difference) is this to your values from Experiment 3.1? Based on this, how important is it to know the frequency accurately?</w:t>
+        <w:t>Using the measured values for frequency and wavelength, calculate the phase velocity of the wave: v_p = λ_g · f. How close (i.e. percentage difference) is this to your values from Experiment 3.1? Based on this, how important is it to know the frequency accurately?</w:t>
       </w:r>
     </w:p>
     <w:p>
@@ -2844,7 +2844,7 @@
         <w:rPr>
           <w:sz w:val="22"/>
         </w:rPr>
-        <w:t>Using cavity-measured frequency and average λg from Experiment 1:</w:t>
+        <w:t>Using cavity-measured frequency and average λ_g from Experiment 1:</w:t>
       </w:r>
     </w:p>
     <w:p>
@@ -2856,7 +2856,7 @@
         <w:rPr>
           <w:sz w:val="22"/>
         </w:rPr>
-        <w:t>vp(11 GHz)  = 32.72 mm × 11.050 GHz = 3.616e+08 m/s  (Exp 1: 3.599e+08 m/s,  % diff = 0.5%)</w:t>
+        <w:t>v_p(11 GHz)  = 32.72 mm × 11.050 GHz = 3.616e+08 m/s  (Exp 1: 3.599e+08 m/s,  % diff = 0.5%)</w:t>
       </w:r>
     </w:p>
     <w:p>
@@ -2868,7 +2868,7 @@
         <w:rPr>
           <w:sz w:val="22"/>
         </w:rPr>
-        <w:t>vp(9.5 GHz) = 43.12 mm × 9.405 GHz = 4.055e+08 m/s  (Exp 1: 4.096e+08 m/s,  % diff = 1.0%)</w:t>
+        <w:t>v_p(9.5 GHz) = 43.12 mm × 9.405 GHz = 4.055e+08 m/s  (Exp 1: 4.096e+08 m/s,  % diff = 1.0%)</w:t>
       </w:r>
     </w:p>
     <w:p>
@@ -2880,7 +2880,7 @@
         <w:rPr>
           <w:sz w:val="22"/>
         </w:rPr>
-        <w:t>vp(8.5 GHz) = 55.68 mm × 8.515 GHz = 4.741e+08 m/s  (Exp 1: 4.733e+08 m/s,  % diff = 0.2%)</w:t>
+        <w:t>v_p(8.5 GHz) = 55.68 mm × 8.515 GHz = 4.741e+08 m/s  (Exp 1: 4.733e+08 m/s,  % diff = 0.2%)</w:t>
       </w:r>
     </w:p>
     <w:p>
@@ -2902,7 +2902,7 @@
         <w:rPr>
           <w:sz w:val="22"/>
         </w:rPr>
-        <w:t>Based on this, knowing the frequency accurately is important but not critical at this level. Since vp = λg · f, a 1% error in frequency directly produces a 1% error in vp. More critically, frequency accuracy matters for mode control: if the operating frequency drifted below the TE₂₀ cutoff (13.09 GHz) it could excite unwanted higher-order modes and corrupt measurements. The cavity meter confirms the oscillator stays within ~0.5% of its set value, which is sufficient for single-mode waveguide operation.</w:t>
+        <w:t>Based on this, knowing the frequency accurately is important but not critical at this level. Since v_p = λ_g · f, a 1% error in frequency directly produces a 1% error in v_p. More critically, frequency accuracy matters for mode control: if the operating frequency drifted below the TE₂₀ cutoff (13.09 GHz) it could excite unwanted higher-order modes and corrupt measurements. The cavity meter confirms the oscillator stays within ~0.5% of its set value, which is sufficient for single-mode waveguide operation.</w:t>
       </w:r>
     </w:p>
     <w:p>
@@ -2925,7 +2925,7 @@
         <w:rPr>
           <w:sz w:val="22"/>
         </w:rPr>
-        <w:t>From Eq. 6: vg = vp0 √(1 − (fc/f)²). As f → fc, the term (fc/f)² → 1, so √(1 − (fc/f)²) → 0 and therefore vg → 0.</w:t>
+        <w:t>From Eq. 6: v_g = v_p0 √(1 − (f_c/f)²). As f → f_c, the term (f_c/f)² → 1, so √(1 − (f_c/f)²) → 0 and therefore v_g → 0.</w:t>
       </w:r>
     </w:p>
     <w:p>
@@ -2948,7 +2948,7 @@
         <w:rPr>
           <w:sz w:val="22"/>
         </w:rPr>
-        <w:t>f = 11 GHz  (f/fc = 1.68):  vg = 2.501e+08 m/s</w:t>
+        <w:t>f = 11 GHz  (f/f_c = 1.68):  v_g = 2.501e+08 m/s</w:t>
       </w:r>
     </w:p>
     <w:p>
@@ -2960,7 +2960,7 @@
         <w:rPr>
           <w:sz w:val="22"/>
         </w:rPr>
-        <w:t>f = 9.5 GHz (f/fc = 1.45):  vg = 2.197e+08 m/s</w:t>
+        <w:t>f = 9.5 GHz (f/f_c = 1.45):  v_g = 2.197e+08 m/s</w:t>
       </w:r>
     </w:p>
     <w:p>
@@ -2972,7 +2972,7 @@
         <w:rPr>
           <w:sz w:val="22"/>
         </w:rPr>
-        <w:t>f = 8.5 GHz (f/fc = 1.30):  vg = 1.902e+08 m/s</w:t>
+        <w:t>f = 8.5 GHz (f/f_c = 1.30):  v_g = 1.902e+08 m/s</w:t>
       </w:r>
     </w:p>
     <w:p>
@@ -2983,7 +2983,7 @@
         <w:rPr>
           <w:sz w:val="22"/>
         </w:rPr>
-        <w:t>As frequency decreases toward fc = 6.54 GHz, vg drops from 2.50×10⁸ to 1.90×10⁸ m/s.</w:t>
+        <w:t>As frequency decreases toward f_c = 6.54 GHz, v_g drops from 2.50×10⁸ to 1.90×10⁸ m/s.</w:t>
       </w:r>
     </w:p>
     <w:p>
@@ -2994,7 +2994,7 @@
         <w:rPr>
           <w:sz w:val="22"/>
         </w:rPr>
-        <w:t>Physical explanation: the TE₁₀ mode can be visualized as two plane waves bouncing obliquely between the broad walls at angle θ to the z-axis, where sin θ = fc/f. As f → fc, θ → 90° — the waves bounce nearly perpendicular to the axis with almost no net axial advance. Energy is trapped bouncing transversely and travels axially more and more slowly. At exactly f = fc the waves bounce straight across (θ = 90°) and vg = 0 — the mode can exist but carries no energy along the guide. Below cutoff the mode becomes evanescent and decays exponentially.</w:t>
+        <w:t>Physical explanation: the TE₁₀ mode can be visualized as two plane waves bouncing obliquely between the broad walls at angle θ to the z-axis, where sin θ = f_c/f. As f → f_c, θ → 90° — the waves bounce nearly perpendicular to the axis with almost no net axial advance. Energy is trapped bouncing transversely and travels axially more and more slowly. At exactly f = f_c the waves bounce straight across (θ = 90°) and v_g = 0 — the mode can exist but carries no energy along the guide. Below cutoff the mode becomes evanescent and decays exponentially.</w:t>
       </w:r>
     </w:p>
     <w:sectPr>

</xml_diff>

<commit_message>
Add λ_g to Table 2; add v_g vs f_c summary table in Q2
</commit_message>
<xml_diff>
--- a/Labs/Lab 3/ECE332_Lab3_Waveguides.docx
+++ b/Labs/Lab 3/ECE332_Lab3_Waveguides.docx
@@ -2615,6 +2615,370 @@
         <w:tblLook w:firstColumn="1" w:firstRow="1" w:lastColumn="0" w:lastRow="0" w:noHBand="0" w:noVBand="1" w:val="04A0"/>
       </w:tblPr>
       <w:tblGrid>
+        <w:gridCol w:w="1728"/>
+        <w:gridCol w:w="1728"/>
+        <w:gridCol w:w="1728"/>
+        <w:gridCol w:w="1728"/>
+        <w:gridCol w:w="1728"/>
+      </w:tblGrid>
+      <w:tr>
+        <w:tc>
+          <w:tcPr>
+            <w:tcW w:type="dxa" w:w="1728"/>
+          </w:tcPr>
+          <w:p>
+            <w:r>
+              <w:rPr>
+                <w:b/>
+              </w:rPr>
+              <w:t>Oscillator f (GHz)</w:t>
+            </w:r>
+          </w:p>
+        </w:tc>
+        <w:tc>
+          <w:tcPr>
+            <w:tcW w:type="dxa" w:w="1728"/>
+          </w:tcPr>
+          <w:p>
+            <w:r>
+              <w:rPr>
+                <w:b/>
+              </w:rPr>
+              <w:t>Measured f (GHz)</w:t>
+            </w:r>
+          </w:p>
+        </w:tc>
+        <w:tc>
+          <w:tcPr>
+            <w:tcW w:type="dxa" w:w="1728"/>
+          </w:tcPr>
+          <w:p>
+            <w:r>
+              <w:rPr>
+                <w:b/>
+              </w:rPr>
+              <w:t>λ_g avg (mm)</w:t>
+            </w:r>
+          </w:p>
+        </w:tc>
+        <w:tc>
+          <w:tcPr>
+            <w:tcW w:type="dxa" w:w="1728"/>
+          </w:tcPr>
+          <w:p>
+            <w:r>
+              <w:rPr>
+                <w:b/>
+              </w:rPr>
+              <w:t>v_p (m/s)</w:t>
+            </w:r>
+          </w:p>
+        </w:tc>
+        <w:tc>
+          <w:tcPr>
+            <w:tcW w:type="dxa" w:w="1728"/>
+          </w:tcPr>
+          <w:p>
+            <w:r>
+              <w:rPr>
+                <w:b/>
+              </w:rPr>
+              <w:t>v_g (m/s)</w:t>
+            </w:r>
+          </w:p>
+        </w:tc>
+      </w:tr>
+      <w:tr>
+        <w:tc>
+          <w:tcPr>
+            <w:tcW w:type="dxa" w:w="1728"/>
+          </w:tcPr>
+          <w:p>
+            <w:r>
+              <w:t>11</w:t>
+            </w:r>
+          </w:p>
+        </w:tc>
+        <w:tc>
+          <w:tcPr>
+            <w:tcW w:type="dxa" w:w="1728"/>
+          </w:tcPr>
+          <w:p>
+            <w:r>
+              <w:t>11.050</w:t>
+            </w:r>
+          </w:p>
+        </w:tc>
+        <w:tc>
+          <w:tcPr>
+            <w:tcW w:type="dxa" w:w="1728"/>
+          </w:tcPr>
+          <w:p>
+            <w:r>
+              <w:t>32.7</w:t>
+            </w:r>
+          </w:p>
+        </w:tc>
+        <w:tc>
+          <w:tcPr>
+            <w:tcW w:type="dxa" w:w="1728"/>
+          </w:tcPr>
+          <w:p>
+            <w:r>
+              <w:t>3.616e+08</w:t>
+            </w:r>
+          </w:p>
+        </w:tc>
+        <w:tc>
+          <w:tcPr>
+            <w:tcW w:type="dxa" w:w="1728"/>
+          </w:tcPr>
+          <w:p>
+            <w:r>
+              <w:t>2.489e+08</w:t>
+            </w:r>
+          </w:p>
+        </w:tc>
+      </w:tr>
+      <w:tr>
+        <w:tc>
+          <w:tcPr>
+            <w:tcW w:type="dxa" w:w="1728"/>
+          </w:tcPr>
+          <w:p>
+            <w:r>
+              <w:t>9.5</w:t>
+            </w:r>
+          </w:p>
+        </w:tc>
+        <w:tc>
+          <w:tcPr>
+            <w:tcW w:type="dxa" w:w="1728"/>
+          </w:tcPr>
+          <w:p>
+            <w:r>
+              <w:t>9.405</w:t>
+            </w:r>
+          </w:p>
+        </w:tc>
+        <w:tc>
+          <w:tcPr>
+            <w:tcW w:type="dxa" w:w="1728"/>
+          </w:tcPr>
+          <w:p>
+            <w:r>
+              <w:t>43.1</w:t>
+            </w:r>
+          </w:p>
+        </w:tc>
+        <w:tc>
+          <w:tcPr>
+            <w:tcW w:type="dxa" w:w="1728"/>
+          </w:tcPr>
+          <w:p>
+            <w:r>
+              <w:t>4.055e+08</w:t>
+            </w:r>
+          </w:p>
+        </w:tc>
+        <w:tc>
+          <w:tcPr>
+            <w:tcW w:type="dxa" w:w="1728"/>
+          </w:tcPr>
+          <w:p>
+            <w:r>
+              <w:t>2.219e+08</w:t>
+            </w:r>
+          </w:p>
+        </w:tc>
+      </w:tr>
+      <w:tr>
+        <w:tc>
+          <w:tcPr>
+            <w:tcW w:type="dxa" w:w="1728"/>
+          </w:tcPr>
+          <w:p>
+            <w:r>
+              <w:t>8.5</w:t>
+            </w:r>
+          </w:p>
+        </w:tc>
+        <w:tc>
+          <w:tcPr>
+            <w:tcW w:type="dxa" w:w="1728"/>
+          </w:tcPr>
+          <w:p>
+            <w:r>
+              <w:t>8.515</w:t>
+            </w:r>
+          </w:p>
+        </w:tc>
+        <w:tc>
+          <w:tcPr>
+            <w:tcW w:type="dxa" w:w="1728"/>
+          </w:tcPr>
+          <w:p>
+            <w:r>
+              <w:t>55.7</w:t>
+            </w:r>
+          </w:p>
+        </w:tc>
+        <w:tc>
+          <w:tcPr>
+            <w:tcW w:type="dxa" w:w="1728"/>
+          </w:tcPr>
+          <w:p>
+            <w:r>
+              <w:t>4.741e+08</w:t>
+            </w:r>
+          </w:p>
+        </w:tc>
+        <w:tc>
+          <w:tcPr>
+            <w:tcW w:type="dxa" w:w="1728"/>
+          </w:tcPr>
+          <w:p>
+            <w:r>
+              <w:t>1.898e+08</w:t>
+            </w:r>
+          </w:p>
+        </w:tc>
+      </w:tr>
+    </w:tbl>
+    <w:p>
+      <w:pPr>
+        <w:spacing w:before="200" w:after="80"/>
+      </w:pPr>
+      <w:r>
+        <w:rPr>
+          <w:b/>
+          <w:sz w:val="28"/>
+        </w:rPr>
+        <w:t>Discussion</w:t>
+      </w:r>
+    </w:p>
+    <w:p>
+      <w:pPr>
+        <w:spacing w:before="160" w:after="40"/>
+      </w:pPr>
+      <w:r>
+        <w:rPr>
+          <w:b/>
+          <w:sz w:val="24"/>
+        </w:rPr>
+        <w:t>Q1 — Phase velocity: vp = λg · f</w:t>
+      </w:r>
+    </w:p>
+    <w:p>
+      <w:pPr>
+        <w:spacing w:after="80"/>
+      </w:pPr>
+      <w:r>
+        <w:rPr>
+          <w:sz w:val="22"/>
+        </w:rPr>
+        <w:t>Using the measured values for frequency and wavelength, calculate the phase velocity of the wave: v_p = λ_g · f. How close (i.e. percentage difference) is this to your values from Experiment 3.1? Based on this, how important is it to know the frequency accurately?</w:t>
+      </w:r>
+    </w:p>
+    <w:p>
+      <w:pPr>
+        <w:spacing w:after="80"/>
+      </w:pPr>
+      <w:r>
+        <w:rPr>
+          <w:sz w:val="22"/>
+        </w:rPr>
+        <w:t>Using cavity-measured frequency and average λ_g from Experiment 1:</w:t>
+      </w:r>
+    </w:p>
+    <w:p>
+      <w:pPr>
+        <w:pStyle w:val="ListBullet"/>
+        <w:spacing w:after="40"/>
+      </w:pPr>
+      <w:r>
+        <w:rPr>
+          <w:sz w:val="22"/>
+        </w:rPr>
+        <w:t>v_p(11 GHz)  = 32.72 mm × 11.050 GHz = 3.616e+08 m/s  (Exp 1: 3.599e+08 m/s,  % diff = 0.5%)</w:t>
+      </w:r>
+    </w:p>
+    <w:p>
+      <w:pPr>
+        <w:pStyle w:val="ListBullet"/>
+        <w:spacing w:after="40"/>
+      </w:pPr>
+      <w:r>
+        <w:rPr>
+          <w:sz w:val="22"/>
+        </w:rPr>
+        <w:t>v_p(9.5 GHz) = 43.12 mm × 9.405 GHz = 4.055e+08 m/s  (Exp 1: 4.096e+08 m/s,  % diff = 1.0%)</w:t>
+      </w:r>
+    </w:p>
+    <w:p>
+      <w:pPr>
+        <w:pStyle w:val="ListBullet"/>
+        <w:spacing w:after="40"/>
+      </w:pPr>
+      <w:r>
+        <w:rPr>
+          <w:sz w:val="22"/>
+        </w:rPr>
+        <w:t>v_p(8.5 GHz) = 55.68 mm × 8.515 GHz = 4.741e+08 m/s  (Exp 1: 4.733e+08 m/s,  % diff = 0.2%)</w:t>
+      </w:r>
+    </w:p>
+    <w:p>
+      <w:pPr>
+        <w:spacing w:after="80"/>
+      </w:pPr>
+      <w:r>
+        <w:rPr>
+          <w:sz w:val="22"/>
+        </w:rPr>
+        <w:t>All three values agree with Experiment 1 to within 1.1%, confirming that the oscillator frequency was close to its set value and that the waveguide wavelength measurements were accurate. Small discrepancies are attributable to vernier scale reading error and minor oscillator frequency drift.</w:t>
+      </w:r>
+    </w:p>
+    <w:p>
+      <w:pPr>
+        <w:spacing w:after="80"/>
+      </w:pPr>
+      <w:r>
+        <w:rPr>
+          <w:sz w:val="22"/>
+        </w:rPr>
+        <w:t>Based on this, knowing the frequency accurately is important but not critical at this level. Since v_p = λ_g · f, a 1% error in frequency directly produces a 1% error in v_p. More critically, frequency accuracy matters for mode control: if the operating frequency drifted below the TE₂₀ cutoff (13.09 GHz) it could excite unwanted higher-order modes and corrupt measurements. The cavity meter confirms the oscillator stays within ~0.5% of its set value, which is sufficient for single-mode waveguide operation.</w:t>
+      </w:r>
+    </w:p>
+    <w:p>
+      <w:pPr>
+        <w:spacing w:before="160" w:after="40"/>
+      </w:pPr>
+      <w:r>
+        <w:rPr>
+          <w:b/>
+          <w:sz w:val="24"/>
+        </w:rPr>
+        <w:t>Q2 — What happens to v_g as f approaches f_c?</w:t>
+      </w:r>
+    </w:p>
+    <w:p>
+      <w:pPr>
+        <w:spacing w:after="80"/>
+      </w:pPr>
+      <w:r>
+        <w:rPr>
+          <w:sz w:val="22"/>
+        </w:rPr>
+        <w:t>From Eq. 6: v_g = v_p0 √(1 − (f_c/f)²). As f → f_c, the term (f_c/f)² → 1, so √(1 − (f_c/f)²) → 0 and therefore v_g → 0. The measured data confirms this trend:</w:t>
+      </w:r>
+    </w:p>
+    <w:tbl>
+      <w:tblPr>
+        <w:tblStyle w:val="TableGrid"/>
+        <w:tblW w:type="auto" w:w="0"/>
+        <w:tblLook w:firstColumn="1" w:firstRow="1" w:lastColumn="0" w:lastRow="0" w:noHBand="0" w:noVBand="1" w:val="04A0"/>
+      </w:tblPr>
+      <w:tblGrid>
         <w:gridCol w:w="2160"/>
         <w:gridCol w:w="2160"/>
         <w:gridCol w:w="2160"/>
@@ -2630,7 +2994,7 @@
               <w:rPr>
                 <w:b/>
               </w:rPr>
-              <w:t>Oscillator f (GHz)</w:t>
+              <w:t>f (GHz)</w:t>
             </w:r>
           </w:p>
         </w:tc>
@@ -2643,7 +3007,20 @@
               <w:rPr>
                 <w:b/>
               </w:rPr>
-              <w:t>Measured f (GHz)</w:t>
+              <w:t>f_c (GHz)</w:t>
+            </w:r>
+          </w:p>
+        </w:tc>
+        <w:tc>
+          <w:tcPr>
+            <w:tcW w:type="dxa" w:w="2160"/>
+          </w:tcPr>
+          <w:p>
+            <w:r>
+              <w:rPr>
+                <w:b/>
+              </w:rPr>
+              <w:t>f / f_c</w:t>
             </w:r>
           </w:p>
         </w:tc>
@@ -2657,19 +3034,6 @@
                 <w:b/>
               </w:rPr>
               <w:t>v_g (m/s)</w:t>
-            </w:r>
-          </w:p>
-        </w:tc>
-        <w:tc>
-          <w:tcPr>
-            <w:tcW w:type="dxa" w:w="2160"/>
-          </w:tcPr>
-          <w:p>
-            <w:r>
-              <w:rPr>
-                <w:b/>
-              </w:rPr>
-              <w:t>v_p (m/s)</w:t>
             </w:r>
           </w:p>
         </w:tc>
@@ -2691,7 +3055,7 @@
           </w:tcPr>
           <w:p>
             <w:r>
-              <w:t>11.050</w:t>
+              <w:t>6.54</w:t>
             </w:r>
           </w:p>
         </w:tc>
@@ -2701,7 +3065,7 @@
           </w:tcPr>
           <w:p>
             <w:r>
-              <w:t>2.489e+08</w:t>
+              <w:t>1.68</w:t>
             </w:r>
           </w:p>
         </w:tc>
@@ -2711,7 +3075,7 @@
           </w:tcPr>
           <w:p>
             <w:r>
-              <w:t>3.616e+08</w:t>
+              <w:t>2.501e+08</w:t>
             </w:r>
           </w:p>
         </w:tc>
@@ -2733,7 +3097,7 @@
           </w:tcPr>
           <w:p>
             <w:r>
-              <w:t>9.405</w:t>
+              <w:t>6.54</w:t>
             </w:r>
           </w:p>
         </w:tc>
@@ -2743,7 +3107,7 @@
           </w:tcPr>
           <w:p>
             <w:r>
-              <w:t>2.219e+08</w:t>
+              <w:t>1.45</w:t>
             </w:r>
           </w:p>
         </w:tc>
@@ -2753,7 +3117,7 @@
           </w:tcPr>
           <w:p>
             <w:r>
-              <w:t>4.055e+08</w:t>
+              <w:t>2.197e+08</w:t>
             </w:r>
           </w:p>
         </w:tc>
@@ -2775,7 +3139,7 @@
           </w:tcPr>
           <w:p>
             <w:r>
-              <w:t>8.515</w:t>
+              <w:t>6.54</w:t>
             </w:r>
           </w:p>
         </w:tc>
@@ -2785,7 +3149,7 @@
           </w:tcPr>
           <w:p>
             <w:r>
-              <w:t>1.898e+08</w:t>
+              <w:t>1.30</w:t>
             </w:r>
           </w:p>
         </w:tc>
@@ -2795,7 +3159,7 @@
           </w:tcPr>
           <w:p>
             <w:r>
-              <w:t>4.741e+08</w:t>
+              <w:t>1.902e+08</w:t>
             </w:r>
           </w:p>
         </w:tc>
@@ -2803,37 +3167,13 @@
     </w:tbl>
     <w:p>
       <w:pPr>
-        <w:spacing w:before="200" w:after="80"/>
-      </w:pPr>
-      <w:r>
-        <w:rPr>
-          <w:b/>
-          <w:sz w:val="28"/>
-        </w:rPr>
-        <w:t>Discussion</w:t>
-      </w:r>
-    </w:p>
-    <w:p>
-      <w:pPr>
-        <w:spacing w:before="160" w:after="40"/>
-      </w:pPr>
-      <w:r>
-        <w:rPr>
-          <w:b/>
-          <w:sz w:val="24"/>
-        </w:rPr>
-        <w:t>Q1 — Phase velocity: vp = λg · f</w:t>
-      </w:r>
-    </w:p>
-    <w:p>
-      <w:pPr>
         <w:spacing w:after="80"/>
       </w:pPr>
       <w:r>
         <w:rPr>
           <w:sz w:val="22"/>
         </w:rPr>
-        <w:t>Using the measured values for frequency and wavelength, calculate the phase velocity of the wave: v_p = λ_g · f. How close (i.e. percentage difference) is this to your values from Experiment 3.1? Based on this, how important is it to know the frequency accurately?</w:t>
+        <w:t>As frequency decreases toward f_c = 6.54 GHz, v_g drops from 2.501e+08 to 1.902e+08 m/s — approaching zero at cutoff.</w:t>
       </w:r>
     </w:p>
     <w:p>
@@ -2844,157 +3184,7 @@
         <w:rPr>
           <w:sz w:val="22"/>
         </w:rPr>
-        <w:t>Using cavity-measured frequency and average λ_g from Experiment 1:</w:t>
-      </w:r>
-    </w:p>
-    <w:p>
-      <w:pPr>
-        <w:pStyle w:val="ListBullet"/>
-        <w:spacing w:after="40"/>
-      </w:pPr>
-      <w:r>
-        <w:rPr>
-          <w:sz w:val="22"/>
-        </w:rPr>
-        <w:t>v_p(11 GHz)  = 32.72 mm × 11.050 GHz = 3.616e+08 m/s  (Exp 1: 3.599e+08 m/s,  % diff = 0.5%)</w:t>
-      </w:r>
-    </w:p>
-    <w:p>
-      <w:pPr>
-        <w:pStyle w:val="ListBullet"/>
-        <w:spacing w:after="40"/>
-      </w:pPr>
-      <w:r>
-        <w:rPr>
-          <w:sz w:val="22"/>
-        </w:rPr>
-        <w:t>v_p(9.5 GHz) = 43.12 mm × 9.405 GHz = 4.055e+08 m/s  (Exp 1: 4.096e+08 m/s,  % diff = 1.0%)</w:t>
-      </w:r>
-    </w:p>
-    <w:p>
-      <w:pPr>
-        <w:pStyle w:val="ListBullet"/>
-        <w:spacing w:after="40"/>
-      </w:pPr>
-      <w:r>
-        <w:rPr>
-          <w:sz w:val="22"/>
-        </w:rPr>
-        <w:t>v_p(8.5 GHz) = 55.68 mm × 8.515 GHz = 4.741e+08 m/s  (Exp 1: 4.733e+08 m/s,  % diff = 0.2%)</w:t>
-      </w:r>
-    </w:p>
-    <w:p>
-      <w:pPr>
-        <w:spacing w:after="80"/>
-      </w:pPr>
-      <w:r>
-        <w:rPr>
-          <w:sz w:val="22"/>
-        </w:rPr>
-        <w:t>All three values agree with Experiment 1 to within 1.1%, confirming that the oscillator frequency was close to its set value and that the waveguide wavelength measurements were accurate. Small discrepancies are attributable to vernier scale reading error and minor oscillator frequency drift.</w:t>
-      </w:r>
-    </w:p>
-    <w:p>
-      <w:pPr>
-        <w:spacing w:after="80"/>
-      </w:pPr>
-      <w:r>
-        <w:rPr>
-          <w:sz w:val="22"/>
-        </w:rPr>
-        <w:t>Based on this, knowing the frequency accurately is important but not critical at this level. Since v_p = λ_g · f, a 1% error in frequency directly produces a 1% error in v_p. More critically, frequency accuracy matters for mode control: if the operating frequency drifted below the TE₂₀ cutoff (13.09 GHz) it could excite unwanted higher-order modes and corrupt measurements. The cavity meter confirms the oscillator stays within ~0.5% of its set value, which is sufficient for single-mode waveguide operation.</w:t>
-      </w:r>
-    </w:p>
-    <w:p>
-      <w:pPr>
-        <w:spacing w:before="160" w:after="40"/>
-      </w:pPr>
-      <w:r>
-        <w:rPr>
-          <w:b/>
-          <w:sz w:val="24"/>
-        </w:rPr>
-        <w:t>Q2 — What happens to vg as f approaches fc?</w:t>
-      </w:r>
-    </w:p>
-    <w:p>
-      <w:pPr>
-        <w:spacing w:after="80"/>
-      </w:pPr>
-      <w:r>
-        <w:rPr>
-          <w:sz w:val="22"/>
-        </w:rPr>
-        <w:t>From Eq. 6: v_g = v_p0 √(1 − (f_c/f)²). As f → f_c, the term (f_c/f)² → 1, so √(1 − (f_c/f)²) → 0 and therefore v_g → 0.</w:t>
-      </w:r>
-    </w:p>
-    <w:p>
-      <w:pPr>
-        <w:spacing w:after="80"/>
-      </w:pPr>
-      <w:r>
-        <w:rPr>
-          <w:sz w:val="22"/>
-        </w:rPr>
-        <w:t>The measured data confirms this trend:</w:t>
-      </w:r>
-    </w:p>
-    <w:p>
-      <w:pPr>
-        <w:pStyle w:val="ListBullet"/>
-        <w:spacing w:after="40"/>
-      </w:pPr>
-      <w:r>
-        <w:rPr>
-          <w:sz w:val="22"/>
-        </w:rPr>
-        <w:t>f = 11 GHz  (f/f_c = 1.68):  v_g = 2.501e+08 m/s</w:t>
-      </w:r>
-    </w:p>
-    <w:p>
-      <w:pPr>
-        <w:pStyle w:val="ListBullet"/>
-        <w:spacing w:after="40"/>
-      </w:pPr>
-      <w:r>
-        <w:rPr>
-          <w:sz w:val="22"/>
-        </w:rPr>
-        <w:t>f = 9.5 GHz (f/f_c = 1.45):  v_g = 2.197e+08 m/s</w:t>
-      </w:r>
-    </w:p>
-    <w:p>
-      <w:pPr>
-        <w:pStyle w:val="ListBullet"/>
-        <w:spacing w:after="40"/>
-      </w:pPr>
-      <w:r>
-        <w:rPr>
-          <w:sz w:val="22"/>
-        </w:rPr>
-        <w:t>f = 8.5 GHz (f/f_c = 1.30):  v_g = 1.902e+08 m/s</w:t>
-      </w:r>
-    </w:p>
-    <w:p>
-      <w:pPr>
-        <w:spacing w:after="80"/>
-      </w:pPr>
-      <w:r>
-        <w:rPr>
-          <w:sz w:val="22"/>
-        </w:rPr>
-        <w:t>As frequency decreases toward f_c = 6.54 GHz, v_g drops from 2.50×10⁸ to 1.90×10⁸ m/s.</w:t>
-      </w:r>
-    </w:p>
-    <w:p>
-      <w:pPr>
-        <w:spacing w:after="80"/>
-      </w:pPr>
-      <w:r>
-        <w:rPr>
-          <w:sz w:val="22"/>
-        </w:rPr>
-        <w:t>Physical explanation: the TE₁₀ mode can be visualized as two plane waves bouncing obliquely between the broad walls at angle θ to the z-axis, where sin θ = f_c/f. As f → f_c, θ → 90° — the waves bounce nearly perpendicular to the axis with almost no net axial advance. Energy is trapped bouncing transversely and travels axially more and more slowly. At exactly f = f_c the waves bounce straight across (θ = 90°) and v_g = 0 — the mode can exist but carries no energy along the guide. Below cutoff the mode becomes evanescent and decays exponentially.</w:t>
+        <w:t>Physical explanation: the TE₁₀ mode can be visualized as two plane waves bouncing obliquely between the broad walls at angle θ to the z-axis, where sin θ = f_c/f. As f → f_c, θ → 90° — the waves bounce nearly perpendicular to the axis with almost no net axial advance. Energy is trapped bouncing transversely and travels axially more and more slowly. At exactly f = f_c the waves bounce straight across (θ = 90°) and v_g = 0 — the mode carries no energy along the guide. Below cutoff the mode becomes evanescent and decays exponentially.</w:t>
       </w:r>
     </w:p>
     <w:sectPr>

</xml_diff>

<commit_message>
Fix Table 1: remove dashes from Max rows (leave blank)
</commit_message>
<xml_diff>
--- a/Labs/Lab 3/ECE332_Lab3_Waveguides.docx
+++ b/Labs/Lab 3/ECE332_Lab3_Waveguides.docx
@@ -845,9 +845,7 @@
             <w:tcW w:type="dxa" w:w="1728"/>
           </w:tcPr>
           <w:p>
-            <w:r>
-              <w:t>—</w:t>
-            </w:r>
+            <w:r/>
           </w:p>
         </w:tc>
         <w:tc>
@@ -855,9 +853,7 @@
             <w:tcW w:type="dxa" w:w="1728"/>
           </w:tcPr>
           <w:p>
-            <w:r>
-              <w:t>—</w:t>
-            </w:r>
+            <w:r/>
           </w:p>
         </w:tc>
         <w:tc>
@@ -865,9 +861,7 @@
             <w:tcW w:type="dxa" w:w="1728"/>
           </w:tcPr>
           <w:p>
-            <w:r>
-              <w:t>—</w:t>
-            </w:r>
+            <w:r/>
           </w:p>
         </w:tc>
       </w:tr>
@@ -949,9 +943,7 @@
             <w:tcW w:type="dxa" w:w="1728"/>
           </w:tcPr>
           <w:p>
-            <w:r>
-              <w:t>—</w:t>
-            </w:r>
+            <w:r/>
           </w:p>
         </w:tc>
         <w:tc>
@@ -959,9 +951,7 @@
             <w:tcW w:type="dxa" w:w="1728"/>
           </w:tcPr>
           <w:p>
-            <w:r>
-              <w:t>—</w:t>
-            </w:r>
+            <w:r/>
           </w:p>
         </w:tc>
         <w:tc>
@@ -969,9 +959,7 @@
             <w:tcW w:type="dxa" w:w="1728"/>
           </w:tcPr>
           <w:p>
-            <w:r>
-              <w:t>—</w:t>
-            </w:r>
+            <w:r/>
           </w:p>
         </w:tc>
       </w:tr>
@@ -1053,9 +1041,7 @@
             <w:tcW w:type="dxa" w:w="1728"/>
           </w:tcPr>
           <w:p>
-            <w:r>
-              <w:t>—</w:t>
-            </w:r>
+            <w:r/>
           </w:p>
         </w:tc>
         <w:tc>
@@ -1063,9 +1049,7 @@
             <w:tcW w:type="dxa" w:w="1728"/>
           </w:tcPr>
           <w:p>
-            <w:r>
-              <w:t>—</w:t>
-            </w:r>
+            <w:r/>
           </w:p>
         </w:tc>
         <w:tc>
@@ -1073,9 +1057,7 @@
             <w:tcW w:type="dxa" w:w="1728"/>
           </w:tcPr>
           <w:p>
-            <w:r>
-              <w:t>—</w:t>
-            </w:r>
+            <w:r/>
           </w:p>
         </w:tc>
       </w:tr>
@@ -1251,9 +1233,7 @@
             <w:tcW w:type="dxa" w:w="1728"/>
           </w:tcPr>
           <w:p>
-            <w:r>
-              <w:t>—</w:t>
-            </w:r>
+            <w:r/>
           </w:p>
         </w:tc>
         <w:tc>
@@ -1261,9 +1241,7 @@
             <w:tcW w:type="dxa" w:w="1728"/>
           </w:tcPr>
           <w:p>
-            <w:r>
-              <w:t>—</w:t>
-            </w:r>
+            <w:r/>
           </w:p>
         </w:tc>
         <w:tc>
@@ -1271,9 +1249,7 @@
             <w:tcW w:type="dxa" w:w="1728"/>
           </w:tcPr>
           <w:p>
-            <w:r>
-              <w:t>—</w:t>
-            </w:r>
+            <w:r/>
           </w:p>
         </w:tc>
       </w:tr>
@@ -1355,9 +1331,7 @@
             <w:tcW w:type="dxa" w:w="1728"/>
           </w:tcPr>
           <w:p>
-            <w:r>
-              <w:t>—</w:t>
-            </w:r>
+            <w:r/>
           </w:p>
         </w:tc>
         <w:tc>
@@ -1365,9 +1339,7 @@
             <w:tcW w:type="dxa" w:w="1728"/>
           </w:tcPr>
           <w:p>
-            <w:r>
-              <w:t>—</w:t>
-            </w:r>
+            <w:r/>
           </w:p>
         </w:tc>
         <w:tc>
@@ -1375,9 +1347,7 @@
             <w:tcW w:type="dxa" w:w="1728"/>
           </w:tcPr>
           <w:p>
-            <w:r>
-              <w:t>—</w:t>
-            </w:r>
+            <w:r/>
           </w:p>
         </w:tc>
       </w:tr>
@@ -1459,9 +1429,7 @@
             <w:tcW w:type="dxa" w:w="1728"/>
           </w:tcPr>
           <w:p>
-            <w:r>
-              <w:t>—</w:t>
-            </w:r>
+            <w:r/>
           </w:p>
         </w:tc>
         <w:tc>
@@ -1469,9 +1437,7 @@
             <w:tcW w:type="dxa" w:w="1728"/>
           </w:tcPr>
           <w:p>
-            <w:r>
-              <w:t>—</w:t>
-            </w:r>
+            <w:r/>
           </w:p>
         </w:tc>
         <w:tc>
@@ -1479,9 +1445,7 @@
             <w:tcW w:type="dxa" w:w="1728"/>
           </w:tcPr>
           <w:p>
-            <w:r>
-              <w:t>—</w:t>
-            </w:r>
+            <w:r/>
           </w:p>
         </w:tc>
       </w:tr>
@@ -1657,9 +1621,7 @@
             <w:tcW w:type="dxa" w:w="1728"/>
           </w:tcPr>
           <w:p>
-            <w:r>
-              <w:t>—</w:t>
-            </w:r>
+            <w:r/>
           </w:p>
         </w:tc>
         <w:tc>
@@ -1667,9 +1629,7 @@
             <w:tcW w:type="dxa" w:w="1728"/>
           </w:tcPr>
           <w:p>
-            <w:r>
-              <w:t>—</w:t>
-            </w:r>
+            <w:r/>
           </w:p>
         </w:tc>
         <w:tc>
@@ -1677,9 +1637,7 @@
             <w:tcW w:type="dxa" w:w="1728"/>
           </w:tcPr>
           <w:p>
-            <w:r>
-              <w:t>—</w:t>
-            </w:r>
+            <w:r/>
           </w:p>
         </w:tc>
       </w:tr>
@@ -1761,9 +1719,7 @@
             <w:tcW w:type="dxa" w:w="1728"/>
           </w:tcPr>
           <w:p>
-            <w:r>
-              <w:t>—</w:t>
-            </w:r>
+            <w:r/>
           </w:p>
         </w:tc>
         <w:tc>
@@ -1771,9 +1727,7 @@
             <w:tcW w:type="dxa" w:w="1728"/>
           </w:tcPr>
           <w:p>
-            <w:r>
-              <w:t>—</w:t>
-            </w:r>
+            <w:r/>
           </w:p>
         </w:tc>
         <w:tc>
@@ -1781,9 +1735,7 @@
             <w:tcW w:type="dxa" w:w="1728"/>
           </w:tcPr>
           <w:p>
-            <w:r>
-              <w:t>—</w:t>
-            </w:r>
+            <w:r/>
           </w:p>
         </w:tc>
       </w:tr>
@@ -1865,9 +1817,7 @@
             <w:tcW w:type="dxa" w:w="1728"/>
           </w:tcPr>
           <w:p>
-            <w:r>
-              <w:t>—</w:t>
-            </w:r>
+            <w:r/>
           </w:p>
         </w:tc>
         <w:tc>
@@ -1875,9 +1825,7 @@
             <w:tcW w:type="dxa" w:w="1728"/>
           </w:tcPr>
           <w:p>
-            <w:r>
-              <w:t>—</w:t>
-            </w:r>
+            <w:r/>
           </w:p>
         </w:tc>
         <w:tc>
@@ -1885,9 +1833,7 @@
             <w:tcW w:type="dxa" w:w="1728"/>
           </w:tcPr>
           <w:p>
-            <w:r>
-              <w:t>—</w:t>
-            </w:r>
+            <w:r/>
           </w:p>
         </w:tc>
       </w:tr>

</xml_diff>

<commit_message>
Table 1: fill λ_g/v_p/v_g for every consecutive pair (all rows except Max 3)
</commit_message>
<xml_diff>
--- a/Labs/Lab 3/ECE332_Lab3_Waveguides.docx
+++ b/Labs/Lab 3/ECE332_Lab3_Waveguides.docx
@@ -845,7 +845,9 @@
             <w:tcW w:type="dxa" w:w="1728"/>
           </w:tcPr>
           <w:p>
-            <w:r/>
+            <w:r>
+              <w:t>36.0</w:t>
+            </w:r>
           </w:p>
         </w:tc>
         <w:tc>
@@ -853,7 +855,9 @@
             <w:tcW w:type="dxa" w:w="1728"/>
           </w:tcPr>
           <w:p>
-            <w:r/>
+            <w:r>
+              <w:t>3.960e+08</w:t>
+            </w:r>
           </w:p>
         </w:tc>
         <w:tc>
@@ -861,7 +865,9 @@
             <w:tcW w:type="dxa" w:w="1728"/>
           </w:tcPr>
           <w:p>
-            <w:r/>
+            <w:r>
+              <w:t>2.273e+08</w:t>
+            </w:r>
           </w:p>
         </w:tc>
       </w:tr>
@@ -943,7 +949,9 @@
             <w:tcW w:type="dxa" w:w="1728"/>
           </w:tcPr>
           <w:p>
-            <w:r/>
+            <w:r>
+              <w:t>34.4</w:t>
+            </w:r>
           </w:p>
         </w:tc>
         <w:tc>
@@ -951,7 +959,9 @@
             <w:tcW w:type="dxa" w:w="1728"/>
           </w:tcPr>
           <w:p>
-            <w:r/>
+            <w:r>
+              <w:t>3.784e+08</w:t>
+            </w:r>
           </w:p>
         </w:tc>
         <w:tc>
@@ -959,7 +969,9 @@
             <w:tcW w:type="dxa" w:w="1728"/>
           </w:tcPr>
           <w:p>
-            <w:r/>
+            <w:r>
+              <w:t>2.378e+08</w:t>
+            </w:r>
           </w:p>
         </w:tc>
       </w:tr>
@@ -1233,7 +1245,9 @@
             <w:tcW w:type="dxa" w:w="1728"/>
           </w:tcPr>
           <w:p>
-            <w:r/>
+            <w:r>
+              <w:t>43.6</w:t>
+            </w:r>
           </w:p>
         </w:tc>
         <w:tc>
@@ -1241,7 +1255,9 @@
             <w:tcW w:type="dxa" w:w="1728"/>
           </w:tcPr>
           <w:p>
-            <w:r/>
+            <w:r>
+              <w:t>4.142e+08</w:t>
+            </w:r>
           </w:p>
         </w:tc>
         <w:tc>
@@ -1249,7 +1265,9 @@
             <w:tcW w:type="dxa" w:w="1728"/>
           </w:tcPr>
           <w:p>
-            <w:r/>
+            <w:r>
+              <w:t>2.173e+08</w:t>
+            </w:r>
           </w:p>
         </w:tc>
       </w:tr>
@@ -1331,7 +1349,9 @@
             <w:tcW w:type="dxa" w:w="1728"/>
           </w:tcPr>
           <w:p>
-            <w:r/>
+            <w:r>
+              <w:t>42.4</w:t>
+            </w:r>
           </w:p>
         </w:tc>
         <w:tc>
@@ -1339,7 +1359,9 @@
             <w:tcW w:type="dxa" w:w="1728"/>
           </w:tcPr>
           <w:p>
-            <w:r/>
+            <w:r>
+              <w:t>4.028e+08</w:t>
+            </w:r>
           </w:p>
         </w:tc>
         <w:tc>
@@ -1347,7 +1369,9 @@
             <w:tcW w:type="dxa" w:w="1728"/>
           </w:tcPr>
           <w:p>
-            <w:r/>
+            <w:r>
+              <w:t>2.234e+08</w:t>
+            </w:r>
           </w:p>
         </w:tc>
       </w:tr>
@@ -1621,7 +1645,9 @@
             <w:tcW w:type="dxa" w:w="1728"/>
           </w:tcPr>
           <w:p>
-            <w:r/>
+            <w:r>
+              <w:t>47.6</w:t>
+            </w:r>
           </w:p>
         </w:tc>
         <w:tc>
@@ -1629,7 +1655,9 @@
             <w:tcW w:type="dxa" w:w="1728"/>
           </w:tcPr>
           <w:p>
-            <w:r/>
+            <w:r>
+              <w:t>4.046e+08</w:t>
+            </w:r>
           </w:p>
         </w:tc>
         <w:tc>
@@ -1637,7 +1665,9 @@
             <w:tcW w:type="dxa" w:w="1728"/>
           </w:tcPr>
           <w:p>
-            <w:r/>
+            <w:r>
+              <w:t>2.224e+08</w:t>
+            </w:r>
           </w:p>
         </w:tc>
       </w:tr>
@@ -1719,7 +1749,9 @@
             <w:tcW w:type="dxa" w:w="1728"/>
           </w:tcPr>
           <w:p>
-            <w:r/>
+            <w:r>
+              <w:t>46.0</w:t>
+            </w:r>
           </w:p>
         </w:tc>
         <w:tc>
@@ -1727,7 +1759,9 @@
             <w:tcW w:type="dxa" w:w="1728"/>
           </w:tcPr>
           <w:p>
-            <w:r/>
+            <w:r>
+              <w:t>3.910e+08</w:t>
+            </w:r>
           </w:p>
         </w:tc>
         <w:tc>
@@ -1735,7 +1769,9 @@
             <w:tcW w:type="dxa" w:w="1728"/>
           </w:tcPr>
           <w:p>
-            <w:r/>
+            <w:r>
+              <w:t>2.302e+08</w:t>
+            </w:r>
           </w:p>
         </w:tc>
       </w:tr>

</xml_diff>